<commit_message>
Added Register Numbers in Word & PDF
</commit_message>
<xml_diff>
--- a/reports/word_documents/Team_108_DP.docx
+++ b/reports/word_documents/Team_108_DP.docx
@@ -42,7 +42,13 @@
         </w:numPr>
       </w:pPr>
       <w:r>
-        <w:t>ARTHIKA G.</w:t>
+        <w:t xml:space="preserve">2025ab05180 </w:t>
+      </w:r>
+      <w:r>
+        <w:t xml:space="preserve">- </w:t>
+      </w:r>
+      <w:r>
+        <w:t>ARTHIKA G</w:t>
       </w:r>
     </w:p>
     <w:p>
@@ -54,7 +60,13 @@
         </w:numPr>
       </w:pPr>
       <w:r>
-        <w:t>SRINEVEDA R S.</w:t>
+        <w:t>2025ab05206</w:t>
+      </w:r>
+      <w:r>
+        <w:t xml:space="preserve"> - </w:t>
+      </w:r>
+      <w:r>
+        <w:t>SRINEVEDA R S</w:t>
       </w:r>
     </w:p>
     <w:p>
@@ -66,7 +78,13 @@
         </w:numPr>
       </w:pPr>
       <w:r>
-        <w:t>ASWATHY H.</w:t>
+        <w:t>2025ab05203</w:t>
+      </w:r>
+      <w:r>
+        <w:t xml:space="preserve"> - </w:t>
+      </w:r>
+      <w:r>
+        <w:t>ASWATHY H</w:t>
       </w:r>
     </w:p>
     <w:p>
@@ -78,6 +96,12 @@
         </w:numPr>
       </w:pPr>
       <w:r>
+        <w:t>2025aa05041</w:t>
+      </w:r>
+      <w:r>
+        <w:t xml:space="preserve"> - </w:t>
+      </w:r>
+      <w:r>
         <w:t>AMIYA PALAI</w:t>
       </w:r>
     </w:p>
@@ -89,6 +113,12 @@
           <w:numId w:val="2"/>
         </w:numPr>
       </w:pPr>
+      <w:r>
+        <w:t>2025ab05229</w:t>
+      </w:r>
+      <w:r>
+        <w:t xml:space="preserve"> - </w:t>
+      </w:r>
       <w:r>
         <w:t>KUTAREKAR NISHCHAL AJAY</w:t>
       </w:r>

</xml_diff>